<commit_message>
simplify the namelist: the case to simulate is chosen with a variable that activates the relevant blocks
</commit_message>
<xml_diff>
--- a/Answers_Form/Answers_Form.docx
+++ b/Answers_Form/Answers_Form.docx
@@ -1,6 +1,6 @@
 
 <file path=word/document.xml><?xml version="1.0" encoding="utf-8"?>
-<w:document xmlns:wpc="http://schemas.microsoft.com/office/word/2010/wordprocessingCanvas" xmlns:cx="http://schemas.microsoft.com/office/drawing/2014/chartex" xmlns:cx1="http://schemas.microsoft.com/office/drawing/2015/9/8/chartex" xmlns:cx2="http://schemas.microsoft.com/office/drawing/2015/10/21/chartex" xmlns:cx3="http://schemas.microsoft.com/office/drawing/2016/5/9/chartex" xmlns:cx4="http://schemas.microsoft.com/office/drawing/2016/5/10/chartex" xmlns:cx5="http://schemas.microsoft.com/office/drawing/2016/5/11/chartex" xmlns:cx6="http://schemas.microsoft.com/office/drawing/2016/5/12/chartex" xmlns:cx7="http://schemas.microsoft.com/office/drawing/2016/5/13/chartex" xmlns:cx8="http://schemas.microsoft.com/office/drawing/2016/5/14/chartex" xmlns:mc="http://schemas.openxmlformats.org/markup-compatibility/2006" xmlns:aink="http://schemas.microsoft.com/office/drawing/2016/ink" xmlns:am3d="http://schemas.microsoft.com/office/drawing/2017/model3d" xmlns:o="urn:schemas-microsoft-com:office:office" xmlns:oel="http://schemas.microsoft.com/office/2019/extlst" xmlns:r="http://schemas.openxmlformats.org/officeDocument/2006/relationships" xmlns:m="http://schemas.openxmlformats.org/officeDocument/2006/math" xmlns:v="urn:schemas-microsoft-com:vml" xmlns:wp14="http://schemas.microsoft.com/office/word/2010/wordprocessingDrawing" xmlns:wp="http://schemas.openxmlformats.org/drawingml/2006/wordprocessingDrawing" xmlns:w10="urn:schemas-microsoft-com:office:word" xmlns:w="http://schemas.openxmlformats.org/wordprocessingml/2006/main" xmlns:w14="http://schemas.microsoft.com/office/word/2010/wordml" xmlns:w15="http://schemas.microsoft.com/office/word/2012/wordml" xmlns:w16cex="http://schemas.microsoft.com/office/word/2018/wordml/cex" xmlns:w16cid="http://schemas.microsoft.com/office/word/2016/wordml/cid" xmlns:w16="http://schemas.microsoft.com/office/word/2018/wordml" xmlns:w16du="http://schemas.microsoft.com/office/word/2023/wordml/word16du" xmlns:w16sdtdh="http://schemas.microsoft.com/office/word/2020/wordml/sdtdatahash" xmlns:w16se="http://schemas.microsoft.com/office/word/2015/wordml/symex" xmlns:wpg="http://schemas.microsoft.com/office/word/2010/wordprocessingGroup" xmlns:wpi="http://schemas.microsoft.com/office/word/2010/wordprocessingInk" xmlns:wne="http://schemas.microsoft.com/office/word/2006/wordml" xmlns:wps="http://schemas.microsoft.com/office/word/2010/wordprocessingShape" mc:Ignorable="w14 w15 w16se w16cid w16 w16cex w16sdtdh w16du wp14">
+<w:document xmlns:wpc="http://schemas.microsoft.com/office/word/2010/wordprocessingCanvas" xmlns:cx="http://schemas.microsoft.com/office/drawing/2014/chartex" xmlns:cx1="http://schemas.microsoft.com/office/drawing/2015/9/8/chartex" xmlns:cx2="http://schemas.microsoft.com/office/drawing/2015/10/21/chartex" xmlns:cx3="http://schemas.microsoft.com/office/drawing/2016/5/9/chartex" xmlns:cx4="http://schemas.microsoft.com/office/drawing/2016/5/10/chartex" xmlns:cx5="http://schemas.microsoft.com/office/drawing/2016/5/11/chartex" xmlns:cx6="http://schemas.microsoft.com/office/drawing/2016/5/12/chartex" xmlns:cx7="http://schemas.microsoft.com/office/drawing/2016/5/13/chartex" xmlns:cx8="http://schemas.microsoft.com/office/drawing/2016/5/14/chartex" xmlns:mc="http://schemas.openxmlformats.org/markup-compatibility/2006" xmlns:aink="http://schemas.microsoft.com/office/drawing/2016/ink" xmlns:am3d="http://schemas.microsoft.com/office/drawing/2017/model3d" xmlns:o="urn:schemas-microsoft-com:office:office" xmlns:oel="http://schemas.microsoft.com/office/2019/extlst" xmlns:r="http://schemas.openxmlformats.org/officeDocument/2006/relationships" xmlns:m="http://schemas.openxmlformats.org/officeDocument/2006/math" xmlns:v="urn:schemas-microsoft-com:vml" xmlns:wp14="http://schemas.microsoft.com/office/word/2010/wordprocessingDrawing" xmlns:wp="http://schemas.openxmlformats.org/drawingml/2006/wordprocessingDrawing" xmlns:w10="urn:schemas-microsoft-com:office:word" xmlns:w="http://schemas.openxmlformats.org/wordprocessingml/2006/main" xmlns:w14="http://schemas.microsoft.com/office/word/2010/wordml" xmlns:w15="http://schemas.microsoft.com/office/word/2012/wordml" xmlns:w16cex="http://schemas.microsoft.com/office/word/2018/wordml/cex" xmlns:w16cid="http://schemas.microsoft.com/office/word/2016/wordml/cid" xmlns:w16="http://schemas.microsoft.com/office/word/2018/wordml" xmlns:w16du="http://schemas.microsoft.com/office/word/2023/wordml/word16du" xmlns:w16sdtdh="http://schemas.microsoft.com/office/word/2020/wordml/sdtdatahash" xmlns:w16sdtfl="http://schemas.microsoft.com/office/word/2024/wordml/sdtformatlock" xmlns:w16se="http://schemas.microsoft.com/office/word/2015/wordml/symex" xmlns:wpg="http://schemas.microsoft.com/office/word/2010/wordprocessingGroup" xmlns:wpi="http://schemas.microsoft.com/office/word/2010/wordprocessingInk" xmlns:wne="http://schemas.microsoft.com/office/word/2006/wordml" xmlns:wps="http://schemas.microsoft.com/office/word/2010/wordprocessingShape" mc:Ignorable="w14 w15 w16se w16cid w16 w16cex w16sdtdh w16sdtfl w16du wp14">
   <w:body>
     <w:p>
       <w:pPr>
@@ -667,19 +667,11 @@
           <w:rFonts w:ascii="Arial" w:hAnsi="Arial" w:cs="Arial"/>
         </w:rPr>
       </w:pPr>
-      <w:proofErr w:type="spellStart"/>
-      <w:r>
-        <w:rPr>
-          <w:rFonts w:ascii="Arial" w:hAnsi="Arial" w:cs="Arial"/>
-        </w:rPr>
-        <w:t>dr</w:t>
-      </w:r>
-      <w:proofErr w:type="spellEnd"/>
-      <w:r>
-        <w:rPr>
-          <w:rFonts w:ascii="Arial" w:hAnsi="Arial" w:cs="Arial"/>
-        </w:rPr>
-        <w:t xml:space="preserve"> (</w:t>
+      <w:r>
+        <w:rPr>
+          <w:rFonts w:ascii="Arial" w:hAnsi="Arial" w:cs="Arial"/>
+        </w:rPr>
+        <w:t>dr (</w:t>
       </w:r>
       <w:proofErr w:type="spellStart"/>
       <w:r>
@@ -1006,13 +998,7 @@
         <w:rPr>
           <w:rFonts w:ascii="Arial" w:hAnsi="Arial" w:cs="Arial"/>
         </w:rPr>
-        <w:t>=</w:t>
-      </w:r>
-      <w:r>
-        <w:rPr>
-          <w:rFonts w:ascii="Arial" w:hAnsi="Arial" w:cs="Arial"/>
-        </w:rPr>
-        <w:t xml:space="preserve"> </w:t>
+        <w:t xml:space="preserve">= </w:t>
       </w:r>
     </w:p>
     <w:p>
@@ -1271,7 +1257,21 @@
         <w:rPr>
           <w:rFonts w:ascii="Arial" w:hAnsi="Arial" w:cs="Arial"/>
         </w:rPr>
-        <w:t xml:space="preserve"> (μm)   </w:t>
+        <w:t xml:space="preserve"> (</w:t>
+      </w:r>
+      <w:proofErr w:type="spellStart"/>
+      <w:r>
+        <w:rPr>
+          <w:rFonts w:ascii="Arial" w:hAnsi="Arial" w:cs="Arial"/>
+        </w:rPr>
+        <w:t>μm</w:t>
+      </w:r>
+      <w:proofErr w:type="spellEnd"/>
+      <w:r>
+        <w:rPr>
+          <w:rFonts w:ascii="Arial" w:hAnsi="Arial" w:cs="Arial"/>
+        </w:rPr>
+        <w:t xml:space="preserve">)   </w:t>
       </w:r>
       <w:r>
         <w:rPr>
@@ -1329,18 +1329,24 @@
           <w:b/>
           <w:bCs/>
         </w:rPr>
-        <w:t xml:space="preserve">Exercise </w:t>
-      </w:r>
-      <w:proofErr w:type="gramStart"/>
-      <w:r>
-        <w:rPr>
-          <w:rFonts w:ascii="Arial" w:hAnsi="Arial" w:cs="Arial"/>
-          <w:b/>
-          <w:bCs/>
-        </w:rPr>
-        <w:t>6 :</w:t>
-      </w:r>
-      <w:proofErr w:type="gramEnd"/>
+        <w:t xml:space="preserve">Exercise 6 </w:t>
+      </w:r>
+      <w:r>
+        <w:rPr>
+          <w:rFonts w:ascii="Arial" w:hAnsi="Arial" w:cs="Arial"/>
+          <w:b/>
+          <w:bCs/>
+        </w:rPr>
+        <w:t>(advanced)</w:t>
+      </w:r>
+      <w:r>
+        <w:rPr>
+          <w:rFonts w:ascii="Arial" w:hAnsi="Arial" w:cs="Arial"/>
+          <w:b/>
+          <w:bCs/>
+        </w:rPr>
+        <w:t>:</w:t>
+      </w:r>
     </w:p>
     <w:p>
       <w:pPr>
@@ -1858,7 +1864,14 @@
         <w:rPr>
           <w:rFonts w:ascii="Arial" w:hAnsi="Arial" w:cs="Arial"/>
         </w:rPr>
-        <w:t>μm</w:t>
+        <w:t>μ</w:t>
+      </w:r>
+      <w:proofErr w:type="gramStart"/>
+      <w:r>
+        <w:rPr>
+          <w:rFonts w:ascii="Arial" w:hAnsi="Arial" w:cs="Arial"/>
+        </w:rPr>
+        <w:t>m</w:t>
       </w:r>
       <w:proofErr w:type="spellEnd"/>
       <w:r>
@@ -1874,6 +1887,7 @@
         </w:rPr>
         <w:t>)</w:t>
       </w:r>
+      <w:proofErr w:type="gramEnd"/>
       <w:r>
         <w:rPr>
           <w:rFonts w:ascii="Arial" w:hAnsi="Arial" w:cs="Arial"/>
@@ -1954,6 +1968,14 @@
     <w:p>
       <w:pPr>
         <w:pStyle w:val="Body"/>
+        <w:rPr>
+          <w:rFonts w:ascii="Arial" w:eastAsia="CMU Serif Roman" w:hAnsi="Arial" w:cs="Arial"/>
+        </w:rPr>
+      </w:pPr>
+    </w:p>
+    <w:p>
+      <w:pPr>
+        <w:pStyle w:val="Body"/>
         <w:numPr>
           <w:ilvl w:val="0"/>
           <w:numId w:val="4"/>
@@ -1970,6 +1992,7 @@
           <w:b/>
           <w:bCs/>
         </w:rPr>
+        <w:lastRenderedPageBreak/>
         <w:t xml:space="preserve">Exercise </w:t>
       </w:r>
       <w:proofErr w:type="gramStart"/>
@@ -1998,7 +2021,6 @@
         <w:rPr>
           <w:rFonts w:ascii="Arial" w:eastAsia="CMU Serif Roman" w:hAnsi="Arial" w:cs="Arial"/>
         </w:rPr>
-        <w:lastRenderedPageBreak/>
         <w:t>Include the requested plot</w:t>
       </w:r>
     </w:p>
@@ -2021,9 +2043,8 @@
           <w:b/>
           <w:bCs/>
         </w:rPr>
-        <w:t xml:space="preserve">Exercise </w:t>
-      </w:r>
-      <w:proofErr w:type="gramStart"/>
+        <w:t>Exercise 1</w:t>
+      </w:r>
       <w:r>
         <w:rPr>
           <w:rFonts w:ascii="Arial" w:hAnsi="Arial" w:cs="Arial"/>
@@ -2038,17 +2059,24 @@
           <w:b/>
           <w:bCs/>
         </w:rPr>
-        <w:t>1</w:t>
-      </w:r>
-      <w:r>
-        <w:rPr>
-          <w:rFonts w:ascii="Arial" w:hAnsi="Arial" w:cs="Arial"/>
-          <w:b/>
-          <w:bCs/>
-        </w:rPr>
-        <w:t xml:space="preserve"> :</w:t>
-      </w:r>
-      <w:proofErr w:type="gramEnd"/>
+        <w:t xml:space="preserve"> </w:t>
+      </w:r>
+      <w:r>
+        <w:rPr>
+          <w:rFonts w:ascii="Arial" w:hAnsi="Arial" w:cs="Arial"/>
+          <w:b/>
+          <w:bCs/>
+        </w:rPr>
+        <w:t>(advanced)</w:t>
+      </w:r>
+      <w:r>
+        <w:rPr>
+          <w:rFonts w:ascii="Arial" w:hAnsi="Arial" w:cs="Arial"/>
+          <w:b/>
+          <w:bCs/>
+        </w:rPr>
+        <w:t>:</w:t>
+      </w:r>
     </w:p>
     <w:p>
       <w:pPr>
@@ -2663,7 +2691,13 @@
         <w:rPr>
           <w:rFonts w:ascii="Arial" w:hAnsi="Arial" w:cs="Arial"/>
         </w:rPr>
-        <w:t xml:space="preserve">                     </w:t>
+        <w:t xml:space="preserve">                </w:t>
+      </w:r>
+      <w:r>
+        <w:rPr>
+          <w:rFonts w:ascii="Arial" w:hAnsi="Arial" w:cs="Arial"/>
+        </w:rPr>
+        <w:tab/>
       </w:r>
       <w:r>
         <w:rPr>
@@ -2776,6 +2810,12 @@
         <w:rPr>
           <w:rFonts w:ascii="Arial" w:hAnsi="Arial" w:cs="Arial"/>
         </w:rPr>
+        <w:tab/>
+      </w:r>
+      <w:r>
+        <w:rPr>
+          <w:rFonts w:ascii="Arial" w:hAnsi="Arial" w:cs="Arial"/>
+        </w:rPr>
         <w:t>=</w:t>
       </w:r>
     </w:p>
@@ -2859,7 +2899,19 @@
         <w:rPr>
           <w:rFonts w:ascii="Arial" w:hAnsi="Arial" w:cs="Arial"/>
         </w:rPr>
-        <w:t>) =</w:t>
+        <w:t xml:space="preserve">) </w:t>
+      </w:r>
+      <w:r>
+        <w:rPr>
+          <w:rFonts w:ascii="Arial" w:hAnsi="Arial" w:cs="Arial"/>
+        </w:rPr>
+        <w:tab/>
+      </w:r>
+      <w:r>
+        <w:rPr>
+          <w:rFonts w:ascii="Arial" w:hAnsi="Arial" w:cs="Arial"/>
+        </w:rPr>
+        <w:t>=</w:t>
       </w:r>
     </w:p>
     <w:p>
@@ -2878,7 +2930,19 @@
         <w:rPr>
           <w:rFonts w:ascii="Arial" w:hAnsi="Arial" w:cs="Arial"/>
         </w:rPr>
-        <w:t xml:space="preserve">Number of bunch macro-particles                       = </w:t>
+        <w:t xml:space="preserve">Number of bunch macro-particles                       </w:t>
+      </w:r>
+      <w:r>
+        <w:rPr>
+          <w:rFonts w:ascii="Arial" w:hAnsi="Arial" w:cs="Arial"/>
+        </w:rPr>
+        <w:tab/>
+      </w:r>
+      <w:r>
+        <w:rPr>
+          <w:rFonts w:ascii="Arial" w:hAnsi="Arial" w:cs="Arial"/>
+        </w:rPr>
+        <w:t xml:space="preserve">= </w:t>
       </w:r>
     </w:p>
     <w:p>
@@ -2947,6 +3011,12 @@
         <w:rPr>
           <w:rFonts w:ascii="Arial" w:hAnsi="Arial" w:cs="Arial"/>
         </w:rPr>
+        <w:tab/>
+      </w:r>
+      <w:r>
+        <w:rPr>
+          <w:rFonts w:ascii="Arial" w:hAnsi="Arial" w:cs="Arial"/>
+        </w:rPr>
         <w:t>=</w:t>
       </w:r>
     </w:p>
@@ -3065,16 +3135,7 @@
           <w:b/>
           <w:bCs/>
         </w:rPr>
-        <w:t xml:space="preserve">Exercise </w:t>
-      </w:r>
-      <w:proofErr w:type="gramStart"/>
-      <w:r>
-        <w:rPr>
-          <w:rFonts w:ascii="Arial" w:hAnsi="Arial" w:cs="Arial"/>
-          <w:b/>
-          <w:bCs/>
-        </w:rPr>
-        <w:t>1</w:t>
+        <w:t>Exercise 1</w:t>
       </w:r>
       <w:r>
         <w:rPr>
@@ -3090,9 +3151,24 @@
           <w:b/>
           <w:bCs/>
         </w:rPr>
-        <w:t xml:space="preserve"> :</w:t>
-      </w:r>
-      <w:proofErr w:type="gramEnd"/>
+        <w:t xml:space="preserve"> </w:t>
+      </w:r>
+      <w:r>
+        <w:rPr>
+          <w:rFonts w:ascii="Arial" w:hAnsi="Arial" w:cs="Arial"/>
+          <w:b/>
+          <w:bCs/>
+        </w:rPr>
+        <w:t>(advanced)</w:t>
+      </w:r>
+      <w:r>
+        <w:rPr>
+          <w:rFonts w:ascii="Arial" w:hAnsi="Arial" w:cs="Arial"/>
+          <w:b/>
+          <w:bCs/>
+        </w:rPr>
+        <w:t>:</w:t>
+      </w:r>
     </w:p>
     <w:p>
       <w:pPr>
@@ -3274,6 +3350,13 @@
       <w:r>
         <w:rPr>
           <w:rFonts w:ascii="Arial" w:hAnsi="Arial" w:cs="Arial"/>
+          <w:vertAlign w:val="superscript"/>
+        </w:rPr>
+        <w:t xml:space="preserve">   </w:t>
+      </w:r>
+      <w:r>
+        <w:rPr>
+          <w:rFonts w:ascii="Arial" w:hAnsi="Arial" w:cs="Arial"/>
         </w:rPr>
         <w:t>=</w:t>
       </w:r>
@@ -3305,6 +3388,13 @@
       <w:r>
         <w:rPr>
           <w:rFonts w:ascii="Arial" w:hAnsi="Arial" w:cs="Arial"/>
+          <w:vertAlign w:val="superscript"/>
+        </w:rPr>
+        <w:t xml:space="preserve">   </w:t>
+      </w:r>
+      <w:r>
+        <w:rPr>
+          <w:rFonts w:ascii="Arial" w:hAnsi="Arial" w:cs="Arial"/>
         </w:rPr>
         <w:t xml:space="preserve">= </w:t>
       </w:r>
@@ -3338,13 +3428,13 @@
         <w:rPr>
           <w:rFonts w:ascii="Arial" w:hAnsi="Arial" w:cs="Arial"/>
         </w:rPr>
-        <w:t xml:space="preserve">)     </w:t>
-      </w:r>
-      <w:r>
-        <w:rPr>
-          <w:rFonts w:ascii="Arial" w:hAnsi="Arial" w:cs="Arial"/>
-        </w:rPr>
-        <w:tab/>
+        <w:t>)</w:t>
+      </w:r>
+      <w:r>
+        <w:rPr>
+          <w:rFonts w:ascii="Arial" w:hAnsi="Arial" w:cs="Arial"/>
+        </w:rPr>
+        <w:t xml:space="preserve">.        </w:t>
       </w:r>
       <w:r>
         <w:rPr>
@@ -3383,13 +3473,13 @@
         <w:rPr>
           <w:rFonts w:ascii="Arial" w:hAnsi="Arial" w:cs="Arial"/>
         </w:rPr>
-        <w:t xml:space="preserve"> (GV/m) </w:t>
-      </w:r>
-      <w:r>
-        <w:rPr>
-          <w:rFonts w:ascii="Arial" w:hAnsi="Arial" w:cs="Arial"/>
-        </w:rPr>
-        <w:tab/>
+        <w:t xml:space="preserve"> (GV/m)</w:t>
+      </w:r>
+      <w:r>
+        <w:rPr>
+          <w:rFonts w:ascii="Arial" w:hAnsi="Arial" w:cs="Arial"/>
+        </w:rPr>
+        <w:t xml:space="preserve"> </w:t>
       </w:r>
       <w:r>
         <w:rPr>
@@ -3447,16 +3537,7 @@
           <w:b/>
           <w:bCs/>
         </w:rPr>
-        <w:t xml:space="preserve">Exercise </w:t>
-      </w:r>
-      <w:proofErr w:type="gramStart"/>
-      <w:r>
-        <w:rPr>
-          <w:rFonts w:ascii="Arial" w:hAnsi="Arial" w:cs="Arial"/>
-          <w:b/>
-          <w:bCs/>
-        </w:rPr>
-        <w:t>1</w:t>
+        <w:t>Exercise 1</w:t>
       </w:r>
       <w:r>
         <w:rPr>
@@ -3472,9 +3553,24 @@
           <w:b/>
           <w:bCs/>
         </w:rPr>
-        <w:t xml:space="preserve"> :</w:t>
-      </w:r>
-      <w:proofErr w:type="gramEnd"/>
+        <w:t xml:space="preserve"> </w:t>
+      </w:r>
+      <w:r>
+        <w:rPr>
+          <w:rFonts w:ascii="Arial" w:hAnsi="Arial" w:cs="Arial"/>
+          <w:b/>
+          <w:bCs/>
+        </w:rPr>
+        <w:t>(advanced)</w:t>
+      </w:r>
+      <w:r>
+        <w:rPr>
+          <w:rFonts w:ascii="Arial" w:hAnsi="Arial" w:cs="Arial"/>
+          <w:b/>
+          <w:bCs/>
+        </w:rPr>
+        <w:t>:</w:t>
+      </w:r>
     </w:p>
     <w:p>
       <w:pPr>
@@ -3575,16 +3671,7 @@
           <w:b/>
           <w:bCs/>
         </w:rPr>
-        <w:t xml:space="preserve">Exercise </w:t>
-      </w:r>
-      <w:proofErr w:type="gramStart"/>
-      <w:r>
-        <w:rPr>
-          <w:rFonts w:ascii="Arial" w:hAnsi="Arial" w:cs="Arial"/>
-          <w:b/>
-          <w:bCs/>
-        </w:rPr>
-        <w:t>1</w:t>
+        <w:t>Exercise 1</w:t>
       </w:r>
       <w:r>
         <w:rPr>
@@ -3600,9 +3687,24 @@
           <w:b/>
           <w:bCs/>
         </w:rPr>
-        <w:t xml:space="preserve"> :</w:t>
-      </w:r>
-      <w:proofErr w:type="gramEnd"/>
+        <w:t xml:space="preserve"> </w:t>
+      </w:r>
+      <w:r>
+        <w:rPr>
+          <w:rFonts w:ascii="Arial" w:hAnsi="Arial" w:cs="Arial"/>
+          <w:b/>
+          <w:bCs/>
+        </w:rPr>
+        <w:t>(advanced)</w:t>
+      </w:r>
+      <w:r>
+        <w:rPr>
+          <w:rFonts w:ascii="Arial" w:hAnsi="Arial" w:cs="Arial"/>
+          <w:b/>
+          <w:bCs/>
+        </w:rPr>
+        <w:t>:</w:t>
+      </w:r>
     </w:p>
     <w:p>
       <w:pPr>
@@ -3620,19 +3722,7 @@
         <w:rPr>
           <w:rFonts w:ascii="Arial" w:eastAsia="CMU Serif Roman" w:hAnsi="Arial" w:cs="Arial"/>
         </w:rPr>
-        <w:t>Include a plot with the results of the four simulations (</w:t>
-      </w:r>
-      <w:r>
-        <w:rPr>
-          <w:rFonts w:ascii="Arial" w:eastAsia="CMU Serif Roman" w:hAnsi="Arial" w:cs="Arial"/>
-        </w:rPr>
-        <w:t>Ex of the simulations in the same window</w:t>
-      </w:r>
-      <w:r>
-        <w:rPr>
-          <w:rFonts w:ascii="Arial" w:eastAsia="CMU Serif Roman" w:hAnsi="Arial" w:cs="Arial"/>
-        </w:rPr>
-        <w:t>)</w:t>
+        <w:t>Include a plot with the results of the four simulations (Ex of the simulations in the same window)</w:t>
       </w:r>
       <w:r>
         <w:rPr>
@@ -3774,16 +3864,7 @@
           <w:b/>
           <w:bCs/>
         </w:rPr>
-        <w:t xml:space="preserve">Exercise </w:t>
-      </w:r>
-      <w:proofErr w:type="gramStart"/>
-      <w:r>
-        <w:rPr>
-          <w:rFonts w:ascii="Arial" w:hAnsi="Arial" w:cs="Arial"/>
-          <w:b/>
-          <w:bCs/>
-        </w:rPr>
-        <w:t>1</w:t>
+        <w:t>Exercise 1</w:t>
       </w:r>
       <w:r>
         <w:rPr>
@@ -3799,9 +3880,24 @@
           <w:b/>
           <w:bCs/>
         </w:rPr>
-        <w:t xml:space="preserve"> :</w:t>
-      </w:r>
-      <w:proofErr w:type="gramEnd"/>
+        <w:t xml:space="preserve"> </w:t>
+      </w:r>
+      <w:r>
+        <w:rPr>
+          <w:rFonts w:ascii="Arial" w:hAnsi="Arial" w:cs="Arial"/>
+          <w:b/>
+          <w:bCs/>
+        </w:rPr>
+        <w:t>(advanced)</w:t>
+      </w:r>
+      <w:r>
+        <w:rPr>
+          <w:rFonts w:ascii="Arial" w:hAnsi="Arial" w:cs="Arial"/>
+          <w:b/>
+          <w:bCs/>
+        </w:rPr>
+        <w:t>:</w:t>
+      </w:r>
     </w:p>
     <w:p>
       <w:pPr>
@@ -3949,18 +4045,24 @@
           <w:b/>
           <w:bCs/>
         </w:rPr>
-        <w:t xml:space="preserve">Exercise </w:t>
-      </w:r>
-      <w:proofErr w:type="gramStart"/>
-      <w:r>
-        <w:rPr>
-          <w:rFonts w:ascii="Arial" w:hAnsi="Arial" w:cs="Arial"/>
-          <w:b/>
-          <w:bCs/>
-        </w:rPr>
-        <w:t>19 :</w:t>
-      </w:r>
-      <w:proofErr w:type="gramEnd"/>
+        <w:t xml:space="preserve">Exercise 19 </w:t>
+      </w:r>
+      <w:r>
+        <w:rPr>
+          <w:rFonts w:ascii="Arial" w:hAnsi="Arial" w:cs="Arial"/>
+          <w:b/>
+          <w:bCs/>
+        </w:rPr>
+        <w:t>(advanced)</w:t>
+      </w:r>
+      <w:r>
+        <w:rPr>
+          <w:rFonts w:ascii="Arial" w:hAnsi="Arial" w:cs="Arial"/>
+          <w:b/>
+          <w:bCs/>
+        </w:rPr>
+        <w:t>:</w:t>
+      </w:r>
     </w:p>
     <w:p>
       <w:pPr>
@@ -4017,18 +4119,32 @@
           <w:b/>
           <w:bCs/>
         </w:rPr>
-        <w:t xml:space="preserve">Exercise </w:t>
-      </w:r>
-      <w:proofErr w:type="gramStart"/>
-      <w:r>
-        <w:rPr>
-          <w:rFonts w:ascii="Arial" w:hAnsi="Arial" w:cs="Arial"/>
-          <w:b/>
-          <w:bCs/>
-        </w:rPr>
-        <w:t>20 :</w:t>
-      </w:r>
-      <w:proofErr w:type="gramEnd"/>
+        <w:t xml:space="preserve">Exercise 20 </w:t>
+      </w:r>
+      <w:r>
+        <w:rPr>
+          <w:rFonts w:ascii="Arial" w:hAnsi="Arial" w:cs="Arial"/>
+          <w:b/>
+          <w:bCs/>
+        </w:rPr>
+        <w:t>(advanced</w:t>
+      </w:r>
+      <w:r>
+        <w:rPr>
+          <w:rFonts w:ascii="Arial" w:hAnsi="Arial" w:cs="Arial"/>
+          <w:b/>
+          <w:bCs/>
+        </w:rPr>
+        <w:t>)</w:t>
+      </w:r>
+      <w:r>
+        <w:rPr>
+          <w:rFonts w:ascii="Arial" w:hAnsi="Arial" w:cs="Arial"/>
+          <w:b/>
+          <w:bCs/>
+        </w:rPr>
+        <w:t>:</w:t>
+      </w:r>
     </w:p>
     <w:p>
       <w:pPr>
@@ -4078,7 +4194,7 @@
 </file>
 
 <file path=word/endnotes.xml><?xml version="1.0" encoding="utf-8"?>
-<w:endnotes xmlns:wpc="http://schemas.microsoft.com/office/word/2010/wordprocessingCanvas" xmlns:cx="http://schemas.microsoft.com/office/drawing/2014/chartex" xmlns:cx1="http://schemas.microsoft.com/office/drawing/2015/9/8/chartex" xmlns:cx2="http://schemas.microsoft.com/office/drawing/2015/10/21/chartex" xmlns:cx3="http://schemas.microsoft.com/office/drawing/2016/5/9/chartex" xmlns:cx4="http://schemas.microsoft.com/office/drawing/2016/5/10/chartex" xmlns:cx5="http://schemas.microsoft.com/office/drawing/2016/5/11/chartex" xmlns:cx6="http://schemas.microsoft.com/office/drawing/2016/5/12/chartex" xmlns:cx7="http://schemas.microsoft.com/office/drawing/2016/5/13/chartex" xmlns:cx8="http://schemas.microsoft.com/office/drawing/2016/5/14/chartex" xmlns:mc="http://schemas.openxmlformats.org/markup-compatibility/2006" xmlns:aink="http://schemas.microsoft.com/office/drawing/2016/ink" xmlns:am3d="http://schemas.microsoft.com/office/drawing/2017/model3d" xmlns:o="urn:schemas-microsoft-com:office:office" xmlns:oel="http://schemas.microsoft.com/office/2019/extlst" xmlns:r="http://schemas.openxmlformats.org/officeDocument/2006/relationships" xmlns:m="http://schemas.openxmlformats.org/officeDocument/2006/math" xmlns:v="urn:schemas-microsoft-com:vml" xmlns:wp14="http://schemas.microsoft.com/office/word/2010/wordprocessingDrawing" xmlns:wp="http://schemas.openxmlformats.org/drawingml/2006/wordprocessingDrawing" xmlns:w10="urn:schemas-microsoft-com:office:word" xmlns:w="http://schemas.openxmlformats.org/wordprocessingml/2006/main" xmlns:w14="http://schemas.microsoft.com/office/word/2010/wordml" xmlns:w15="http://schemas.microsoft.com/office/word/2012/wordml" xmlns:w16cex="http://schemas.microsoft.com/office/word/2018/wordml/cex" xmlns:w16cid="http://schemas.microsoft.com/office/word/2016/wordml/cid" xmlns:w16="http://schemas.microsoft.com/office/word/2018/wordml" xmlns:w16du="http://schemas.microsoft.com/office/word/2023/wordml/word16du" xmlns:w16sdtdh="http://schemas.microsoft.com/office/word/2020/wordml/sdtdatahash" xmlns:w16se="http://schemas.microsoft.com/office/word/2015/wordml/symex" xmlns:wpg="http://schemas.microsoft.com/office/word/2010/wordprocessingGroup" xmlns:wpi="http://schemas.microsoft.com/office/word/2010/wordprocessingInk" xmlns:wne="http://schemas.microsoft.com/office/word/2006/wordml" xmlns:wps="http://schemas.microsoft.com/office/word/2010/wordprocessingShape" mc:Ignorable="w14 w15 w16se w16cid w16 w16cex w16sdtdh w16du wp14">
+<w:endnotes xmlns:wpc="http://schemas.microsoft.com/office/word/2010/wordprocessingCanvas" xmlns:cx="http://schemas.microsoft.com/office/drawing/2014/chartex" xmlns:cx1="http://schemas.microsoft.com/office/drawing/2015/9/8/chartex" xmlns:cx2="http://schemas.microsoft.com/office/drawing/2015/10/21/chartex" xmlns:cx3="http://schemas.microsoft.com/office/drawing/2016/5/9/chartex" xmlns:cx4="http://schemas.microsoft.com/office/drawing/2016/5/10/chartex" xmlns:cx5="http://schemas.microsoft.com/office/drawing/2016/5/11/chartex" xmlns:cx6="http://schemas.microsoft.com/office/drawing/2016/5/12/chartex" xmlns:cx7="http://schemas.microsoft.com/office/drawing/2016/5/13/chartex" xmlns:cx8="http://schemas.microsoft.com/office/drawing/2016/5/14/chartex" xmlns:mc="http://schemas.openxmlformats.org/markup-compatibility/2006" xmlns:aink="http://schemas.microsoft.com/office/drawing/2016/ink" xmlns:am3d="http://schemas.microsoft.com/office/drawing/2017/model3d" xmlns:o="urn:schemas-microsoft-com:office:office" xmlns:oel="http://schemas.microsoft.com/office/2019/extlst" xmlns:r="http://schemas.openxmlformats.org/officeDocument/2006/relationships" xmlns:m="http://schemas.openxmlformats.org/officeDocument/2006/math" xmlns:v="urn:schemas-microsoft-com:vml" xmlns:wp14="http://schemas.microsoft.com/office/word/2010/wordprocessingDrawing" xmlns:wp="http://schemas.openxmlformats.org/drawingml/2006/wordprocessingDrawing" xmlns:w10="urn:schemas-microsoft-com:office:word" xmlns:w="http://schemas.openxmlformats.org/wordprocessingml/2006/main" xmlns:w14="http://schemas.microsoft.com/office/word/2010/wordml" xmlns:w15="http://schemas.microsoft.com/office/word/2012/wordml" xmlns:w16cex="http://schemas.microsoft.com/office/word/2018/wordml/cex" xmlns:w16cid="http://schemas.microsoft.com/office/word/2016/wordml/cid" xmlns:w16="http://schemas.microsoft.com/office/word/2018/wordml" xmlns:w16du="http://schemas.microsoft.com/office/word/2023/wordml/word16du" xmlns:w16sdtdh="http://schemas.microsoft.com/office/word/2020/wordml/sdtdatahash" xmlns:w16sdtfl="http://schemas.microsoft.com/office/word/2024/wordml/sdtformatlock" xmlns:w16se="http://schemas.microsoft.com/office/word/2015/wordml/symex" xmlns:wpg="http://schemas.microsoft.com/office/word/2010/wordprocessingGroup" xmlns:wpi="http://schemas.microsoft.com/office/word/2010/wordprocessingInk" xmlns:wne="http://schemas.microsoft.com/office/word/2006/wordml" xmlns:wps="http://schemas.microsoft.com/office/word/2010/wordprocessingShape" mc:Ignorable="w14 w15 w16se w16cid w16 w16cex w16sdtdh w16sdtfl w16du wp14">
   <w:endnote w:type="separator" w:id="-1">
     <w:p>
       <w:r>
@@ -4097,13 +4213,13 @@
 </file>
 
 <file path=word/footer1.xml><?xml version="1.0" encoding="utf-8"?>
-<w:ftr xmlns:wpc="http://schemas.microsoft.com/office/word/2010/wordprocessingCanvas" xmlns:cx="http://schemas.microsoft.com/office/drawing/2014/chartex" xmlns:cx1="http://schemas.microsoft.com/office/drawing/2015/9/8/chartex" xmlns:cx2="http://schemas.microsoft.com/office/drawing/2015/10/21/chartex" xmlns:cx3="http://schemas.microsoft.com/office/drawing/2016/5/9/chartex" xmlns:cx4="http://schemas.microsoft.com/office/drawing/2016/5/10/chartex" xmlns:cx5="http://schemas.microsoft.com/office/drawing/2016/5/11/chartex" xmlns:cx6="http://schemas.microsoft.com/office/drawing/2016/5/12/chartex" xmlns:cx7="http://schemas.microsoft.com/office/drawing/2016/5/13/chartex" xmlns:cx8="http://schemas.microsoft.com/office/drawing/2016/5/14/chartex" xmlns:mc="http://schemas.openxmlformats.org/markup-compatibility/2006" xmlns:aink="http://schemas.microsoft.com/office/drawing/2016/ink" xmlns:am3d="http://schemas.microsoft.com/office/drawing/2017/model3d" xmlns:o="urn:schemas-microsoft-com:office:office" xmlns:oel="http://schemas.microsoft.com/office/2019/extlst" xmlns:r="http://schemas.openxmlformats.org/officeDocument/2006/relationships" xmlns:m="http://schemas.openxmlformats.org/officeDocument/2006/math" xmlns:v="urn:schemas-microsoft-com:vml" xmlns:wp14="http://schemas.microsoft.com/office/word/2010/wordprocessingDrawing" xmlns:wp="http://schemas.openxmlformats.org/drawingml/2006/wordprocessingDrawing" xmlns:w10="urn:schemas-microsoft-com:office:word" xmlns:w="http://schemas.openxmlformats.org/wordprocessingml/2006/main" xmlns:w14="http://schemas.microsoft.com/office/word/2010/wordml" xmlns:w15="http://schemas.microsoft.com/office/word/2012/wordml" xmlns:w16cex="http://schemas.microsoft.com/office/word/2018/wordml/cex" xmlns:w16cid="http://schemas.microsoft.com/office/word/2016/wordml/cid" xmlns:w16="http://schemas.microsoft.com/office/word/2018/wordml" xmlns:w16du="http://schemas.microsoft.com/office/word/2023/wordml/word16du" xmlns:w16sdtdh="http://schemas.microsoft.com/office/word/2020/wordml/sdtdatahash" xmlns:w16se="http://schemas.microsoft.com/office/word/2015/wordml/symex" xmlns:wpg="http://schemas.microsoft.com/office/word/2010/wordprocessingGroup" xmlns:wpi="http://schemas.microsoft.com/office/word/2010/wordprocessingInk" xmlns:wne="http://schemas.microsoft.com/office/word/2006/wordml" xmlns:wps="http://schemas.microsoft.com/office/word/2010/wordprocessingShape" mc:Ignorable="w14 w15 w16se w16cid w16 w16cex w16sdtdh w16du wp14">
+<w:ftr xmlns:wpc="http://schemas.microsoft.com/office/word/2010/wordprocessingCanvas" xmlns:cx="http://schemas.microsoft.com/office/drawing/2014/chartex" xmlns:cx1="http://schemas.microsoft.com/office/drawing/2015/9/8/chartex" xmlns:cx2="http://schemas.microsoft.com/office/drawing/2015/10/21/chartex" xmlns:cx3="http://schemas.microsoft.com/office/drawing/2016/5/9/chartex" xmlns:cx4="http://schemas.microsoft.com/office/drawing/2016/5/10/chartex" xmlns:cx5="http://schemas.microsoft.com/office/drawing/2016/5/11/chartex" xmlns:cx6="http://schemas.microsoft.com/office/drawing/2016/5/12/chartex" xmlns:cx7="http://schemas.microsoft.com/office/drawing/2016/5/13/chartex" xmlns:cx8="http://schemas.microsoft.com/office/drawing/2016/5/14/chartex" xmlns:mc="http://schemas.openxmlformats.org/markup-compatibility/2006" xmlns:aink="http://schemas.microsoft.com/office/drawing/2016/ink" xmlns:am3d="http://schemas.microsoft.com/office/drawing/2017/model3d" xmlns:o="urn:schemas-microsoft-com:office:office" xmlns:oel="http://schemas.microsoft.com/office/2019/extlst" xmlns:r="http://schemas.openxmlformats.org/officeDocument/2006/relationships" xmlns:m="http://schemas.openxmlformats.org/officeDocument/2006/math" xmlns:v="urn:schemas-microsoft-com:vml" xmlns:wp14="http://schemas.microsoft.com/office/word/2010/wordprocessingDrawing" xmlns:wp="http://schemas.openxmlformats.org/drawingml/2006/wordprocessingDrawing" xmlns:w10="urn:schemas-microsoft-com:office:word" xmlns:w="http://schemas.openxmlformats.org/wordprocessingml/2006/main" xmlns:w14="http://schemas.microsoft.com/office/word/2010/wordml" xmlns:w15="http://schemas.microsoft.com/office/word/2012/wordml" xmlns:w16cex="http://schemas.microsoft.com/office/word/2018/wordml/cex" xmlns:w16cid="http://schemas.microsoft.com/office/word/2016/wordml/cid" xmlns:w16="http://schemas.microsoft.com/office/word/2018/wordml" xmlns:w16du="http://schemas.microsoft.com/office/word/2023/wordml/word16du" xmlns:w16sdtdh="http://schemas.microsoft.com/office/word/2020/wordml/sdtdatahash" xmlns:w16sdtfl="http://schemas.microsoft.com/office/word/2024/wordml/sdtformatlock" xmlns:w16se="http://schemas.microsoft.com/office/word/2015/wordml/symex" xmlns:wpg="http://schemas.microsoft.com/office/word/2010/wordprocessingGroup" xmlns:wpi="http://schemas.microsoft.com/office/word/2010/wordprocessingInk" xmlns:wne="http://schemas.microsoft.com/office/word/2006/wordml" xmlns:wps="http://schemas.microsoft.com/office/word/2010/wordprocessingShape" mc:Ignorable="w14 w15 w16se w16cid w16 w16cex w16sdtdh w16sdtfl w16du wp14">
   <w:p/>
 </w:ftr>
 </file>
 
 <file path=word/footnotes.xml><?xml version="1.0" encoding="utf-8"?>
-<w:footnotes xmlns:wpc="http://schemas.microsoft.com/office/word/2010/wordprocessingCanvas" xmlns:cx="http://schemas.microsoft.com/office/drawing/2014/chartex" xmlns:cx1="http://schemas.microsoft.com/office/drawing/2015/9/8/chartex" xmlns:cx2="http://schemas.microsoft.com/office/drawing/2015/10/21/chartex" xmlns:cx3="http://schemas.microsoft.com/office/drawing/2016/5/9/chartex" xmlns:cx4="http://schemas.microsoft.com/office/drawing/2016/5/10/chartex" xmlns:cx5="http://schemas.microsoft.com/office/drawing/2016/5/11/chartex" xmlns:cx6="http://schemas.microsoft.com/office/drawing/2016/5/12/chartex" xmlns:cx7="http://schemas.microsoft.com/office/drawing/2016/5/13/chartex" xmlns:cx8="http://schemas.microsoft.com/office/drawing/2016/5/14/chartex" xmlns:mc="http://schemas.openxmlformats.org/markup-compatibility/2006" xmlns:aink="http://schemas.microsoft.com/office/drawing/2016/ink" xmlns:am3d="http://schemas.microsoft.com/office/drawing/2017/model3d" xmlns:o="urn:schemas-microsoft-com:office:office" xmlns:oel="http://schemas.microsoft.com/office/2019/extlst" xmlns:r="http://schemas.openxmlformats.org/officeDocument/2006/relationships" xmlns:m="http://schemas.openxmlformats.org/officeDocument/2006/math" xmlns:v="urn:schemas-microsoft-com:vml" xmlns:wp14="http://schemas.microsoft.com/office/word/2010/wordprocessingDrawing" xmlns:wp="http://schemas.openxmlformats.org/drawingml/2006/wordprocessingDrawing" xmlns:w10="urn:schemas-microsoft-com:office:word" xmlns:w="http://schemas.openxmlformats.org/wordprocessingml/2006/main" xmlns:w14="http://schemas.microsoft.com/office/word/2010/wordml" xmlns:w15="http://schemas.microsoft.com/office/word/2012/wordml" xmlns:w16cex="http://schemas.microsoft.com/office/word/2018/wordml/cex" xmlns:w16cid="http://schemas.microsoft.com/office/word/2016/wordml/cid" xmlns:w16="http://schemas.microsoft.com/office/word/2018/wordml" xmlns:w16du="http://schemas.microsoft.com/office/word/2023/wordml/word16du" xmlns:w16sdtdh="http://schemas.microsoft.com/office/word/2020/wordml/sdtdatahash" xmlns:w16se="http://schemas.microsoft.com/office/word/2015/wordml/symex" xmlns:wpg="http://schemas.microsoft.com/office/word/2010/wordprocessingGroup" xmlns:wpi="http://schemas.microsoft.com/office/word/2010/wordprocessingInk" xmlns:wne="http://schemas.microsoft.com/office/word/2006/wordml" xmlns:wps="http://schemas.microsoft.com/office/word/2010/wordprocessingShape" mc:Ignorable="w14 w15 w16se w16cid w16 w16cex w16sdtdh w16du wp14">
+<w:footnotes xmlns:wpc="http://schemas.microsoft.com/office/word/2010/wordprocessingCanvas" xmlns:cx="http://schemas.microsoft.com/office/drawing/2014/chartex" xmlns:cx1="http://schemas.microsoft.com/office/drawing/2015/9/8/chartex" xmlns:cx2="http://schemas.microsoft.com/office/drawing/2015/10/21/chartex" xmlns:cx3="http://schemas.microsoft.com/office/drawing/2016/5/9/chartex" xmlns:cx4="http://schemas.microsoft.com/office/drawing/2016/5/10/chartex" xmlns:cx5="http://schemas.microsoft.com/office/drawing/2016/5/11/chartex" xmlns:cx6="http://schemas.microsoft.com/office/drawing/2016/5/12/chartex" xmlns:cx7="http://schemas.microsoft.com/office/drawing/2016/5/13/chartex" xmlns:cx8="http://schemas.microsoft.com/office/drawing/2016/5/14/chartex" xmlns:mc="http://schemas.openxmlformats.org/markup-compatibility/2006" xmlns:aink="http://schemas.microsoft.com/office/drawing/2016/ink" xmlns:am3d="http://schemas.microsoft.com/office/drawing/2017/model3d" xmlns:o="urn:schemas-microsoft-com:office:office" xmlns:oel="http://schemas.microsoft.com/office/2019/extlst" xmlns:r="http://schemas.openxmlformats.org/officeDocument/2006/relationships" xmlns:m="http://schemas.openxmlformats.org/officeDocument/2006/math" xmlns:v="urn:schemas-microsoft-com:vml" xmlns:wp14="http://schemas.microsoft.com/office/word/2010/wordprocessingDrawing" xmlns:wp="http://schemas.openxmlformats.org/drawingml/2006/wordprocessingDrawing" xmlns:w10="urn:schemas-microsoft-com:office:word" xmlns:w="http://schemas.openxmlformats.org/wordprocessingml/2006/main" xmlns:w14="http://schemas.microsoft.com/office/word/2010/wordml" xmlns:w15="http://schemas.microsoft.com/office/word/2012/wordml" xmlns:w16cex="http://schemas.microsoft.com/office/word/2018/wordml/cex" xmlns:w16cid="http://schemas.microsoft.com/office/word/2016/wordml/cid" xmlns:w16="http://schemas.microsoft.com/office/word/2018/wordml" xmlns:w16du="http://schemas.microsoft.com/office/word/2023/wordml/word16du" xmlns:w16sdtdh="http://schemas.microsoft.com/office/word/2020/wordml/sdtdatahash" xmlns:w16sdtfl="http://schemas.microsoft.com/office/word/2024/wordml/sdtformatlock" xmlns:w16se="http://schemas.microsoft.com/office/word/2015/wordml/symex" xmlns:wpg="http://schemas.microsoft.com/office/word/2010/wordprocessingGroup" xmlns:wpi="http://schemas.microsoft.com/office/word/2010/wordprocessingInk" xmlns:wne="http://schemas.microsoft.com/office/word/2006/wordml" xmlns:wps="http://schemas.microsoft.com/office/word/2010/wordprocessingShape" mc:Ignorable="w14 w15 w16se w16cid w16 w16cex w16sdtdh w16sdtfl w16du wp14">
   <w:footnote w:type="separator" w:id="-1">
     <w:p>
       <w:r>
@@ -4122,13 +4238,13 @@
 </file>
 
 <file path=word/header1.xml><?xml version="1.0" encoding="utf-8"?>
-<w:hdr xmlns:wpc="http://schemas.microsoft.com/office/word/2010/wordprocessingCanvas" xmlns:cx="http://schemas.microsoft.com/office/drawing/2014/chartex" xmlns:cx1="http://schemas.microsoft.com/office/drawing/2015/9/8/chartex" xmlns:cx2="http://schemas.microsoft.com/office/drawing/2015/10/21/chartex" xmlns:cx3="http://schemas.microsoft.com/office/drawing/2016/5/9/chartex" xmlns:cx4="http://schemas.microsoft.com/office/drawing/2016/5/10/chartex" xmlns:cx5="http://schemas.microsoft.com/office/drawing/2016/5/11/chartex" xmlns:cx6="http://schemas.microsoft.com/office/drawing/2016/5/12/chartex" xmlns:cx7="http://schemas.microsoft.com/office/drawing/2016/5/13/chartex" xmlns:cx8="http://schemas.microsoft.com/office/drawing/2016/5/14/chartex" xmlns:mc="http://schemas.openxmlformats.org/markup-compatibility/2006" xmlns:aink="http://schemas.microsoft.com/office/drawing/2016/ink" xmlns:am3d="http://schemas.microsoft.com/office/drawing/2017/model3d" xmlns:o="urn:schemas-microsoft-com:office:office" xmlns:oel="http://schemas.microsoft.com/office/2019/extlst" xmlns:r="http://schemas.openxmlformats.org/officeDocument/2006/relationships" xmlns:m="http://schemas.openxmlformats.org/officeDocument/2006/math" xmlns:v="urn:schemas-microsoft-com:vml" xmlns:wp14="http://schemas.microsoft.com/office/word/2010/wordprocessingDrawing" xmlns:wp="http://schemas.openxmlformats.org/drawingml/2006/wordprocessingDrawing" xmlns:w10="urn:schemas-microsoft-com:office:word" xmlns:w="http://schemas.openxmlformats.org/wordprocessingml/2006/main" xmlns:w14="http://schemas.microsoft.com/office/word/2010/wordml" xmlns:w15="http://schemas.microsoft.com/office/word/2012/wordml" xmlns:w16cex="http://schemas.microsoft.com/office/word/2018/wordml/cex" xmlns:w16cid="http://schemas.microsoft.com/office/word/2016/wordml/cid" xmlns:w16="http://schemas.microsoft.com/office/word/2018/wordml" xmlns:w16du="http://schemas.microsoft.com/office/word/2023/wordml/word16du" xmlns:w16sdtdh="http://schemas.microsoft.com/office/word/2020/wordml/sdtdatahash" xmlns:w16se="http://schemas.microsoft.com/office/word/2015/wordml/symex" xmlns:wpg="http://schemas.microsoft.com/office/word/2010/wordprocessingGroup" xmlns:wpi="http://schemas.microsoft.com/office/word/2010/wordprocessingInk" xmlns:wne="http://schemas.microsoft.com/office/word/2006/wordml" xmlns:wps="http://schemas.microsoft.com/office/word/2010/wordprocessingShape" mc:Ignorable="w14 w15 w16se w16cid w16 w16cex w16sdtdh w16du wp14">
+<w:hdr xmlns:wpc="http://schemas.microsoft.com/office/word/2010/wordprocessingCanvas" xmlns:cx="http://schemas.microsoft.com/office/drawing/2014/chartex" xmlns:cx1="http://schemas.microsoft.com/office/drawing/2015/9/8/chartex" xmlns:cx2="http://schemas.microsoft.com/office/drawing/2015/10/21/chartex" xmlns:cx3="http://schemas.microsoft.com/office/drawing/2016/5/9/chartex" xmlns:cx4="http://schemas.microsoft.com/office/drawing/2016/5/10/chartex" xmlns:cx5="http://schemas.microsoft.com/office/drawing/2016/5/11/chartex" xmlns:cx6="http://schemas.microsoft.com/office/drawing/2016/5/12/chartex" xmlns:cx7="http://schemas.microsoft.com/office/drawing/2016/5/13/chartex" xmlns:cx8="http://schemas.microsoft.com/office/drawing/2016/5/14/chartex" xmlns:mc="http://schemas.openxmlformats.org/markup-compatibility/2006" xmlns:aink="http://schemas.microsoft.com/office/drawing/2016/ink" xmlns:am3d="http://schemas.microsoft.com/office/drawing/2017/model3d" xmlns:o="urn:schemas-microsoft-com:office:office" xmlns:oel="http://schemas.microsoft.com/office/2019/extlst" xmlns:r="http://schemas.openxmlformats.org/officeDocument/2006/relationships" xmlns:m="http://schemas.openxmlformats.org/officeDocument/2006/math" xmlns:v="urn:schemas-microsoft-com:vml" xmlns:wp14="http://schemas.microsoft.com/office/word/2010/wordprocessingDrawing" xmlns:wp="http://schemas.openxmlformats.org/drawingml/2006/wordprocessingDrawing" xmlns:w10="urn:schemas-microsoft-com:office:word" xmlns:w="http://schemas.openxmlformats.org/wordprocessingml/2006/main" xmlns:w14="http://schemas.microsoft.com/office/word/2010/wordml" xmlns:w15="http://schemas.microsoft.com/office/word/2012/wordml" xmlns:w16cex="http://schemas.microsoft.com/office/word/2018/wordml/cex" xmlns:w16cid="http://schemas.microsoft.com/office/word/2016/wordml/cid" xmlns:w16="http://schemas.microsoft.com/office/word/2018/wordml" xmlns:w16du="http://schemas.microsoft.com/office/word/2023/wordml/word16du" xmlns:w16sdtdh="http://schemas.microsoft.com/office/word/2020/wordml/sdtdatahash" xmlns:w16sdtfl="http://schemas.microsoft.com/office/word/2024/wordml/sdtformatlock" xmlns:w16se="http://schemas.microsoft.com/office/word/2015/wordml/symex" xmlns:wpg="http://schemas.microsoft.com/office/word/2010/wordprocessingGroup" xmlns:wpi="http://schemas.microsoft.com/office/word/2010/wordprocessingInk" xmlns:wne="http://schemas.microsoft.com/office/word/2006/wordml" xmlns:wps="http://schemas.microsoft.com/office/word/2010/wordprocessingShape" mc:Ignorable="w14 w15 w16se w16cid w16 w16cex w16sdtdh w16sdtfl w16du wp14">
   <w:p/>
 </w:hdr>
 </file>
 
 <file path=word/numbering.xml><?xml version="1.0" encoding="utf-8"?>
-<w:numbering xmlns:wpc="http://schemas.microsoft.com/office/word/2010/wordprocessingCanvas" xmlns:cx="http://schemas.microsoft.com/office/drawing/2014/chartex" xmlns:cx1="http://schemas.microsoft.com/office/drawing/2015/9/8/chartex" xmlns:cx2="http://schemas.microsoft.com/office/drawing/2015/10/21/chartex" xmlns:cx3="http://schemas.microsoft.com/office/drawing/2016/5/9/chartex" xmlns:cx4="http://schemas.microsoft.com/office/drawing/2016/5/10/chartex" xmlns:cx5="http://schemas.microsoft.com/office/drawing/2016/5/11/chartex" xmlns:cx6="http://schemas.microsoft.com/office/drawing/2016/5/12/chartex" xmlns:cx7="http://schemas.microsoft.com/office/drawing/2016/5/13/chartex" xmlns:cx8="http://schemas.microsoft.com/office/drawing/2016/5/14/chartex" xmlns:mc="http://schemas.openxmlformats.org/markup-compatibility/2006" xmlns:aink="http://schemas.microsoft.com/office/drawing/2016/ink" xmlns:am3d="http://schemas.microsoft.com/office/drawing/2017/model3d" xmlns:o="urn:schemas-microsoft-com:office:office" xmlns:oel="http://schemas.microsoft.com/office/2019/extlst" xmlns:r="http://schemas.openxmlformats.org/officeDocument/2006/relationships" xmlns:m="http://schemas.openxmlformats.org/officeDocument/2006/math" xmlns:v="urn:schemas-microsoft-com:vml" xmlns:wp14="http://schemas.microsoft.com/office/word/2010/wordprocessingDrawing" xmlns:wp="http://schemas.openxmlformats.org/drawingml/2006/wordprocessingDrawing" xmlns:w10="urn:schemas-microsoft-com:office:word" xmlns:w="http://schemas.openxmlformats.org/wordprocessingml/2006/main" xmlns:w14="http://schemas.microsoft.com/office/word/2010/wordml" xmlns:w15="http://schemas.microsoft.com/office/word/2012/wordml" xmlns:w16cex="http://schemas.microsoft.com/office/word/2018/wordml/cex" xmlns:w16cid="http://schemas.microsoft.com/office/word/2016/wordml/cid" xmlns:w16="http://schemas.microsoft.com/office/word/2018/wordml" xmlns:w16du="http://schemas.microsoft.com/office/word/2023/wordml/word16du" xmlns:w16sdtdh="http://schemas.microsoft.com/office/word/2020/wordml/sdtdatahash" xmlns:w16se="http://schemas.microsoft.com/office/word/2015/wordml/symex" xmlns:wpg="http://schemas.microsoft.com/office/word/2010/wordprocessingGroup" xmlns:wpi="http://schemas.microsoft.com/office/word/2010/wordprocessingInk" xmlns:wne="http://schemas.microsoft.com/office/word/2006/wordml" xmlns:wps="http://schemas.microsoft.com/office/word/2010/wordprocessingShape" mc:Ignorable="w14 w15 w16se w16cid w16 w16cex w16sdtdh w16du wp14">
+<w:numbering xmlns:wpc="http://schemas.microsoft.com/office/word/2010/wordprocessingCanvas" xmlns:cx="http://schemas.microsoft.com/office/drawing/2014/chartex" xmlns:cx1="http://schemas.microsoft.com/office/drawing/2015/9/8/chartex" xmlns:cx2="http://schemas.microsoft.com/office/drawing/2015/10/21/chartex" xmlns:cx3="http://schemas.microsoft.com/office/drawing/2016/5/9/chartex" xmlns:cx4="http://schemas.microsoft.com/office/drawing/2016/5/10/chartex" xmlns:cx5="http://schemas.microsoft.com/office/drawing/2016/5/11/chartex" xmlns:cx6="http://schemas.microsoft.com/office/drawing/2016/5/12/chartex" xmlns:cx7="http://schemas.microsoft.com/office/drawing/2016/5/13/chartex" xmlns:cx8="http://schemas.microsoft.com/office/drawing/2016/5/14/chartex" xmlns:mc="http://schemas.openxmlformats.org/markup-compatibility/2006" xmlns:aink="http://schemas.microsoft.com/office/drawing/2016/ink" xmlns:am3d="http://schemas.microsoft.com/office/drawing/2017/model3d" xmlns:o="urn:schemas-microsoft-com:office:office" xmlns:oel="http://schemas.microsoft.com/office/2019/extlst" xmlns:r="http://schemas.openxmlformats.org/officeDocument/2006/relationships" xmlns:m="http://schemas.openxmlformats.org/officeDocument/2006/math" xmlns:v="urn:schemas-microsoft-com:vml" xmlns:wp14="http://schemas.microsoft.com/office/word/2010/wordprocessingDrawing" xmlns:wp="http://schemas.openxmlformats.org/drawingml/2006/wordprocessingDrawing" xmlns:w10="urn:schemas-microsoft-com:office:word" xmlns:w="http://schemas.openxmlformats.org/wordprocessingml/2006/main" xmlns:w14="http://schemas.microsoft.com/office/word/2010/wordml" xmlns:w15="http://schemas.microsoft.com/office/word/2012/wordml" xmlns:w16cex="http://schemas.microsoft.com/office/word/2018/wordml/cex" xmlns:w16cid="http://schemas.microsoft.com/office/word/2016/wordml/cid" xmlns:w16="http://schemas.microsoft.com/office/word/2018/wordml" xmlns:w16du="http://schemas.microsoft.com/office/word/2023/wordml/word16du" xmlns:w16sdtdh="http://schemas.microsoft.com/office/word/2020/wordml/sdtdatahash" xmlns:w16sdtfl="http://schemas.microsoft.com/office/word/2024/wordml/sdtformatlock" xmlns:w16se="http://schemas.microsoft.com/office/word/2015/wordml/symex" xmlns:wpg="http://schemas.microsoft.com/office/word/2010/wordprocessingGroup" xmlns:wpi="http://schemas.microsoft.com/office/word/2010/wordprocessingInk" xmlns:wne="http://schemas.microsoft.com/office/word/2006/wordml" xmlns:wps="http://schemas.microsoft.com/office/word/2010/wordprocessingShape" mc:Ignorable="w14 w15 w16se w16cid w16 w16cex w16sdtdh w16sdtfl w16du wp14">
   <w:abstractNum w:abstractNumId="0" w15:restartNumberingAfterBreak="0">
     <w:nsid w:val="103024A9"/>
     <w:multiLevelType w:val="hybridMultilevel"/>
@@ -8256,7 +8372,7 @@
 </file>
 
 <file path=word/styles.xml><?xml version="1.0" encoding="utf-8"?>
-<w:styles xmlns:mc="http://schemas.openxmlformats.org/markup-compatibility/2006" xmlns:r="http://schemas.openxmlformats.org/officeDocument/2006/relationships" xmlns:w="http://schemas.openxmlformats.org/wordprocessingml/2006/main" xmlns:w14="http://schemas.microsoft.com/office/word/2010/wordml" xmlns:w15="http://schemas.microsoft.com/office/word/2012/wordml" xmlns:w16cex="http://schemas.microsoft.com/office/word/2018/wordml/cex" xmlns:w16cid="http://schemas.microsoft.com/office/word/2016/wordml/cid" xmlns:w16="http://schemas.microsoft.com/office/word/2018/wordml" xmlns:w16du="http://schemas.microsoft.com/office/word/2023/wordml/word16du" xmlns:w16sdtdh="http://schemas.microsoft.com/office/word/2020/wordml/sdtdatahash" xmlns:w16se="http://schemas.microsoft.com/office/word/2015/wordml/symex" mc:Ignorable="w14 w15 w16se w16cid w16 w16cex w16sdtdh w16du">
+<w:styles xmlns:mc="http://schemas.openxmlformats.org/markup-compatibility/2006" xmlns:r="http://schemas.openxmlformats.org/officeDocument/2006/relationships" xmlns:w="http://schemas.openxmlformats.org/wordprocessingml/2006/main" xmlns:w14="http://schemas.microsoft.com/office/word/2010/wordml" xmlns:w15="http://schemas.microsoft.com/office/word/2012/wordml" xmlns:w16cex="http://schemas.microsoft.com/office/word/2018/wordml/cex" xmlns:w16cid="http://schemas.microsoft.com/office/word/2016/wordml/cid" xmlns:w16="http://schemas.microsoft.com/office/word/2018/wordml" xmlns:w16du="http://schemas.microsoft.com/office/word/2023/wordml/word16du" xmlns:w16sdtdh="http://schemas.microsoft.com/office/word/2020/wordml/sdtdatahash" xmlns:w16sdtfl="http://schemas.microsoft.com/office/word/2024/wordml/sdtformatlock" xmlns:w16se="http://schemas.microsoft.com/office/word/2015/wordml/symex" mc:Ignorable="w14 w15 w16se w16cid w16 w16cex w16sdtdh w16sdtfl w16du">
   <w:docDefaults>
     <w:rPrDefault>
       <w:rPr>

</xml_diff>